<commit_message>
style: optimize brain icon and change sports medicine icon to injury protection shield in Venn diagram
</commit_message>
<xml_diff>
--- a/CV_TT.docx
+++ b/CV_TT.docx
@@ -2197,45 +2197,144 @@
         <w:rPr>
           <w:b/>
         </w:rPr>
-        <w:t>專業技能 (SKILLS)</w:t>
+        <w:t>專業技能</w:t>
+      </w:r>
+      <w:r>
+        <w:rPr>
+          <w:b/>
+        </w:rPr>
+        <w:t xml:space="preserve"> (SKILLS)</w:t>
       </w:r>
     </w:p>
     <w:p>
-      <w:r>
-        <w:t>• 認知神經科學測量：腦電圖 (EEG)</w:t>
+      <w:pPr>
+        <w:pStyle w:val="a9"/>
+        <w:numPr>
+          <w:ilvl w:val="0"/>
+          <w:numId w:val="16"/>
+        </w:numPr>
+        <w:ind w:leftChars="200"/>
+      </w:pPr>
+      <w:r>
+        <w:t>認知神經科學測量：腦電圖</w:t>
+      </w:r>
+      <w:r>
+        <w:t xml:space="preserve"> (EEG)</w:t>
       </w:r>
     </w:p>
     <w:p>
-      <w:r>
-        <w:t>• 生物生理測量：最大攝氧量 (VO2max)、體適能</w:t>
+      <w:pPr>
+        <w:pStyle w:val="a9"/>
+        <w:numPr>
+          <w:ilvl w:val="0"/>
+          <w:numId w:val="16"/>
+        </w:numPr>
+        <w:ind w:leftChars="200"/>
+      </w:pPr>
+      <w:r>
+        <w:t>生物生理測量：</w:t>
+      </w:r>
+      <w:proofErr w:type="gramStart"/>
+      <w:r>
+        <w:t>最大攝氧量</w:t>
+      </w:r>
+      <w:proofErr w:type="gramEnd"/>
+      <w:r>
+        <w:t xml:space="preserve"> (VO2max)</w:t>
+      </w:r>
+      <w:r>
+        <w:t>、體適能</w:t>
       </w:r>
     </w:p>
     <w:p>
-      <w:r>
-        <w:t>• 腦電圖數據分析軟體：EEGlab, SPM12, HHSA toolbox</w:t>
+      <w:pPr>
+        <w:pStyle w:val="a9"/>
+        <w:numPr>
+          <w:ilvl w:val="0"/>
+          <w:numId w:val="16"/>
+        </w:numPr>
+        <w:ind w:leftChars="200"/>
+      </w:pPr>
+      <w:r>
+        <w:t>腦電圖數據分析軟體：</w:t>
+      </w:r>
+      <w:r>
+        <w:t>EEGlab, SPM12, HHSA toolbox</w:t>
       </w:r>
     </w:p>
     <w:p>
-      <w:r>
-        <w:t>• 程式分析軟體：Matlab, Python</w:t>
+      <w:pPr>
+        <w:pStyle w:val="a9"/>
+        <w:numPr>
+          <w:ilvl w:val="0"/>
+          <w:numId w:val="16"/>
+        </w:numPr>
+        <w:ind w:leftChars="200"/>
+      </w:pPr>
+      <w:r>
+        <w:t>程式分析軟體：</w:t>
+      </w:r>
+      <w:r>
+        <w:t>Matlab, Python</w:t>
       </w:r>
     </w:p>
     <w:p>
-      <w:r>
-        <w:t>• 統計軟體：SPSS, JASP</w:t>
+      <w:pPr>
+        <w:pStyle w:val="a9"/>
+        <w:numPr>
+          <w:ilvl w:val="0"/>
+          <w:numId w:val="16"/>
+        </w:numPr>
+        <w:ind w:leftChars="200"/>
+      </w:pPr>
+      <w:r>
+        <w:t>統計軟體：</w:t>
+      </w:r>
+      <w:r>
+        <w:t>SPSS, JASP</w:t>
       </w:r>
     </w:p>
     <w:p>
-      <w:r>
-        <w:t>• 辦公軟體：Microsoft Word, Excel, and PowerPoint</w:t>
+      <w:pPr>
+        <w:pStyle w:val="a9"/>
+        <w:numPr>
+          <w:ilvl w:val="0"/>
+          <w:numId w:val="16"/>
+        </w:numPr>
+        <w:ind w:leftChars="200"/>
+      </w:pPr>
+      <w:r>
+        <w:t>辦公軟體：</w:t>
+      </w:r>
+      <w:r>
+        <w:t>Microsoft Word, Excel, and PowerPoint</w:t>
       </w:r>
     </w:p>
     <w:p>
-      <w:r>
-        <w:t>• 語言能力：精通：中文 (Mandarin Chinese)；中等：英文 (English)</w:t>
+      <w:pPr>
+        <w:pStyle w:val="a9"/>
+        <w:numPr>
+          <w:ilvl w:val="0"/>
+          <w:numId w:val="16"/>
+        </w:numPr>
+        <w:ind w:leftChars="200"/>
+        <w:rPr>
+          <w:rFonts w:hint="eastAsia"/>
+        </w:rPr>
+      </w:pPr>
+      <w:r>
+        <w:t>語言能力：精通：中文</w:t>
+      </w:r>
+      <w:r>
+        <w:t xml:space="preserve"> (Mandarin Chinese)</w:t>
+      </w:r>
+      <w:r>
+        <w:t>；中等：英文</w:t>
+      </w:r>
+      <w:r>
+        <w:t xml:space="preserve"> (English)</w:t>
       </w:r>
     </w:p>
-    <w:p/>
     <w:p>
       <w:pPr>
         <w:rPr>
@@ -2526,7 +2625,14 @@
         <w:rPr>
           <w:rFonts w:cs="Times New Roman"/>
         </w:rPr>
-        <w:t>。比較傳統式與血流限制阻力健身運動對計畫</w:t>
+        <w:t>。比較傳統式與血流限制阻力</w:t>
+      </w:r>
+      <w:r>
+        <w:rPr>
+          <w:rFonts w:cs="Times New Roman"/>
+        </w:rPr>
+        <w:lastRenderedPageBreak/>
+        <w:t>健身運動對計畫</w:t>
       </w:r>
       <w:r>
         <w:rPr>
@@ -3147,14 +3253,7 @@
         <w:rPr>
           <w:rFonts w:cs="Times New Roman" w:hint="eastAsia"/>
         </w:rPr>
-        <w:t xml:space="preserve">[The effects of acute aerobic exercise on planning-related </w:t>
-      </w:r>
-      <w:r>
-        <w:rPr>
-          <w:rFonts w:cs="Times New Roman" w:hint="eastAsia"/>
-        </w:rPr>
-        <w:lastRenderedPageBreak/>
-        <w:t>executive function in older adults: The moderating role of physical activity expenditure and sedentary behavior duration]</w:t>
+        <w:t>[The effects of acute aerobic exercise on planning-related executive function in older adults: The moderating role of physical activity expenditure and sedentary behavior duration]</w:t>
       </w:r>
       <w:r>
         <w:rPr>
@@ -4800,6 +4899,7 @@
         <w:rPr>
           <w:rFonts w:cs="Times New Roman"/>
         </w:rPr>
+        <w:lastRenderedPageBreak/>
         <w:t xml:space="preserve">Chen, F. T., </w:t>
       </w:r>
       <w:r>
@@ -5117,7 +5217,6 @@
         <w:rPr>
           <w:rFonts w:cs="Times New Roman"/>
         </w:rPr>
-        <w:lastRenderedPageBreak/>
         <w:t xml:space="preserve">Chen, F. T., Chen, H. Y., Hung, C. S., </w:t>
       </w:r>
       <w:r>
@@ -6745,6 +6844,7 @@
         <w:rPr>
           <w:rFonts w:cs="Times New Roman"/>
         </w:rPr>
+        <w:lastRenderedPageBreak/>
         <w:t>陳律仰、</w:t>
       </w:r>
       <w:r>
@@ -7521,6 +7621,118 @@
     </w:lvl>
   </w:abstractNum>
   <w:abstractNum w:abstractNumId="5" w15:restartNumberingAfterBreak="0">
+    <w:nsid w:val="363E32A4"/>
+    <w:multiLevelType w:val="hybridMultilevel"/>
+    <w:tmpl w:val="F56A9C2C"/>
+    <w:lvl w:ilvl="0" w:tplc="321E2BF6">
+      <w:numFmt w:val="bullet"/>
+      <w:lvlText w:val="•"/>
+      <w:lvlJc w:val="left"/>
+      <w:pPr>
+        <w:ind w:left="840" w:hanging="360"/>
+      </w:pPr>
+      <w:rPr>
+        <w:rFonts w:ascii="Times New Roman" w:eastAsia="標楷體" w:hAnsi="Times New Roman" w:cs="Times New Roman" w:hint="default"/>
+      </w:rPr>
+    </w:lvl>
+    <w:lvl w:ilvl="1" w:tplc="04090003" w:tentative="1">
+      <w:start w:val="1"/>
+      <w:numFmt w:val="bullet"/>
+      <w:lvlText w:val=""/>
+      <w:lvlJc w:val="left"/>
+      <w:pPr>
+        <w:ind w:left="1440" w:hanging="480"/>
+      </w:pPr>
+      <w:rPr>
+        <w:rFonts w:ascii="Wingdings" w:hAnsi="Wingdings" w:hint="default"/>
+      </w:rPr>
+    </w:lvl>
+    <w:lvl w:ilvl="2" w:tplc="04090005" w:tentative="1">
+      <w:start w:val="1"/>
+      <w:numFmt w:val="bullet"/>
+      <w:lvlText w:val=""/>
+      <w:lvlJc w:val="left"/>
+      <w:pPr>
+        <w:ind w:left="1920" w:hanging="480"/>
+      </w:pPr>
+      <w:rPr>
+        <w:rFonts w:ascii="Wingdings" w:hAnsi="Wingdings" w:hint="default"/>
+      </w:rPr>
+    </w:lvl>
+    <w:lvl w:ilvl="3" w:tplc="04090001" w:tentative="1">
+      <w:start w:val="1"/>
+      <w:numFmt w:val="bullet"/>
+      <w:lvlText w:val=""/>
+      <w:lvlJc w:val="left"/>
+      <w:pPr>
+        <w:ind w:left="2400" w:hanging="480"/>
+      </w:pPr>
+      <w:rPr>
+        <w:rFonts w:ascii="Wingdings" w:hAnsi="Wingdings" w:hint="default"/>
+      </w:rPr>
+    </w:lvl>
+    <w:lvl w:ilvl="4" w:tplc="04090003" w:tentative="1">
+      <w:start w:val="1"/>
+      <w:numFmt w:val="bullet"/>
+      <w:lvlText w:val=""/>
+      <w:lvlJc w:val="left"/>
+      <w:pPr>
+        <w:ind w:left="2880" w:hanging="480"/>
+      </w:pPr>
+      <w:rPr>
+        <w:rFonts w:ascii="Wingdings" w:hAnsi="Wingdings" w:hint="default"/>
+      </w:rPr>
+    </w:lvl>
+    <w:lvl w:ilvl="5" w:tplc="04090005" w:tentative="1">
+      <w:start w:val="1"/>
+      <w:numFmt w:val="bullet"/>
+      <w:lvlText w:val=""/>
+      <w:lvlJc w:val="left"/>
+      <w:pPr>
+        <w:ind w:left="3360" w:hanging="480"/>
+      </w:pPr>
+      <w:rPr>
+        <w:rFonts w:ascii="Wingdings" w:hAnsi="Wingdings" w:hint="default"/>
+      </w:rPr>
+    </w:lvl>
+    <w:lvl w:ilvl="6" w:tplc="04090001" w:tentative="1">
+      <w:start w:val="1"/>
+      <w:numFmt w:val="bullet"/>
+      <w:lvlText w:val=""/>
+      <w:lvlJc w:val="left"/>
+      <w:pPr>
+        <w:ind w:left="3840" w:hanging="480"/>
+      </w:pPr>
+      <w:rPr>
+        <w:rFonts w:ascii="Wingdings" w:hAnsi="Wingdings" w:hint="default"/>
+      </w:rPr>
+    </w:lvl>
+    <w:lvl w:ilvl="7" w:tplc="04090003" w:tentative="1">
+      <w:start w:val="1"/>
+      <w:numFmt w:val="bullet"/>
+      <w:lvlText w:val=""/>
+      <w:lvlJc w:val="left"/>
+      <w:pPr>
+        <w:ind w:left="4320" w:hanging="480"/>
+      </w:pPr>
+      <w:rPr>
+        <w:rFonts w:ascii="Wingdings" w:hAnsi="Wingdings" w:hint="default"/>
+      </w:rPr>
+    </w:lvl>
+    <w:lvl w:ilvl="8" w:tplc="04090005" w:tentative="1">
+      <w:start w:val="1"/>
+      <w:numFmt w:val="bullet"/>
+      <w:lvlText w:val=""/>
+      <w:lvlJc w:val="left"/>
+      <w:pPr>
+        <w:ind w:left="4800" w:hanging="480"/>
+      </w:pPr>
+      <w:rPr>
+        <w:rFonts w:ascii="Wingdings" w:hAnsi="Wingdings" w:hint="default"/>
+      </w:rPr>
+    </w:lvl>
+  </w:abstractNum>
+  <w:abstractNum w:abstractNumId="6" w15:restartNumberingAfterBreak="0">
     <w:nsid w:val="3CD97EC4"/>
     <w:multiLevelType w:val="hybridMultilevel"/>
     <w:tmpl w:val="71D8EB94"/>
@@ -7633,7 +7845,7 @@
       </w:rPr>
     </w:lvl>
   </w:abstractNum>
-  <w:abstractNum w:abstractNumId="6" w15:restartNumberingAfterBreak="0">
+  <w:abstractNum w:abstractNumId="7" w15:restartNumberingAfterBreak="0">
     <w:nsid w:val="4840083E"/>
     <w:multiLevelType w:val="multilevel"/>
     <w:tmpl w:val="E89E738C"/>
@@ -7746,7 +7958,7 @@
       </w:pPr>
     </w:lvl>
   </w:abstractNum>
-  <w:abstractNum w:abstractNumId="7" w15:restartNumberingAfterBreak="0">
+  <w:abstractNum w:abstractNumId="8" w15:restartNumberingAfterBreak="0">
     <w:nsid w:val="4B152C88"/>
     <w:multiLevelType w:val="hybridMultilevel"/>
     <w:tmpl w:val="84B475AE"/>
@@ -7835,7 +8047,7 @@
       </w:pPr>
     </w:lvl>
   </w:abstractNum>
-  <w:abstractNum w:abstractNumId="8" w15:restartNumberingAfterBreak="0">
+  <w:abstractNum w:abstractNumId="9" w15:restartNumberingAfterBreak="0">
     <w:nsid w:val="4E2B0A41"/>
     <w:multiLevelType w:val="hybridMultilevel"/>
     <w:tmpl w:val="84B475AE"/>
@@ -7924,7 +8136,7 @@
       </w:pPr>
     </w:lvl>
   </w:abstractNum>
-  <w:abstractNum w:abstractNumId="9" w15:restartNumberingAfterBreak="0">
+  <w:abstractNum w:abstractNumId="10" w15:restartNumberingAfterBreak="0">
     <w:nsid w:val="564C59EC"/>
     <w:multiLevelType w:val="hybridMultilevel"/>
     <w:tmpl w:val="DC72BBA6"/>
@@ -8013,7 +8225,7 @@
       </w:pPr>
     </w:lvl>
   </w:abstractNum>
-  <w:abstractNum w:abstractNumId="10" w15:restartNumberingAfterBreak="0">
+  <w:abstractNum w:abstractNumId="11" w15:restartNumberingAfterBreak="0">
     <w:nsid w:val="5FED5C8C"/>
     <w:multiLevelType w:val="hybridMultilevel"/>
     <w:tmpl w:val="74381AD6"/>
@@ -8126,7 +8338,7 @@
       </w:rPr>
     </w:lvl>
   </w:abstractNum>
-  <w:abstractNum w:abstractNumId="11" w15:restartNumberingAfterBreak="0">
+  <w:abstractNum w:abstractNumId="12" w15:restartNumberingAfterBreak="0">
     <w:nsid w:val="6116440E"/>
     <w:multiLevelType w:val="hybridMultilevel"/>
     <w:tmpl w:val="7DFA5650"/>
@@ -8239,7 +8451,7 @@
       </w:rPr>
     </w:lvl>
   </w:abstractNum>
-  <w:abstractNum w:abstractNumId="12" w15:restartNumberingAfterBreak="0">
+  <w:abstractNum w:abstractNumId="13" w15:restartNumberingAfterBreak="0">
     <w:nsid w:val="690A6A36"/>
     <w:multiLevelType w:val="hybridMultilevel"/>
     <w:tmpl w:val="AC1646FE"/>
@@ -8328,7 +8540,7 @@
       </w:pPr>
     </w:lvl>
   </w:abstractNum>
-  <w:abstractNum w:abstractNumId="13" w15:restartNumberingAfterBreak="0">
+  <w:abstractNum w:abstractNumId="14" w15:restartNumberingAfterBreak="0">
     <w:nsid w:val="6D300EA3"/>
     <w:multiLevelType w:val="hybridMultilevel"/>
     <w:tmpl w:val="04BE30FC"/>
@@ -8336,6 +8548,119 @@
       <w:start w:val="1"/>
       <w:numFmt w:val="bullet"/>
       <w:lvlText w:val=""/>
+      <w:lvlJc w:val="left"/>
+      <w:pPr>
+        <w:ind w:left="960" w:hanging="480"/>
+      </w:pPr>
+      <w:rPr>
+        <w:rFonts w:ascii="Wingdings" w:hAnsi="Wingdings" w:hint="default"/>
+      </w:rPr>
+    </w:lvl>
+    <w:lvl w:ilvl="1" w:tplc="04090003" w:tentative="1">
+      <w:start w:val="1"/>
+      <w:numFmt w:val="bullet"/>
+      <w:lvlText w:val=""/>
+      <w:lvlJc w:val="left"/>
+      <w:pPr>
+        <w:ind w:left="1440" w:hanging="480"/>
+      </w:pPr>
+      <w:rPr>
+        <w:rFonts w:ascii="Wingdings" w:hAnsi="Wingdings" w:hint="default"/>
+      </w:rPr>
+    </w:lvl>
+    <w:lvl w:ilvl="2" w:tplc="04090005" w:tentative="1">
+      <w:start w:val="1"/>
+      <w:numFmt w:val="bullet"/>
+      <w:lvlText w:val=""/>
+      <w:lvlJc w:val="left"/>
+      <w:pPr>
+        <w:ind w:left="1920" w:hanging="480"/>
+      </w:pPr>
+      <w:rPr>
+        <w:rFonts w:ascii="Wingdings" w:hAnsi="Wingdings" w:hint="default"/>
+      </w:rPr>
+    </w:lvl>
+    <w:lvl w:ilvl="3" w:tplc="04090001" w:tentative="1">
+      <w:start w:val="1"/>
+      <w:numFmt w:val="bullet"/>
+      <w:lvlText w:val=""/>
+      <w:lvlJc w:val="left"/>
+      <w:pPr>
+        <w:ind w:left="2400" w:hanging="480"/>
+      </w:pPr>
+      <w:rPr>
+        <w:rFonts w:ascii="Wingdings" w:hAnsi="Wingdings" w:hint="default"/>
+      </w:rPr>
+    </w:lvl>
+    <w:lvl w:ilvl="4" w:tplc="04090003" w:tentative="1">
+      <w:start w:val="1"/>
+      <w:numFmt w:val="bullet"/>
+      <w:lvlText w:val=""/>
+      <w:lvlJc w:val="left"/>
+      <w:pPr>
+        <w:ind w:left="2880" w:hanging="480"/>
+      </w:pPr>
+      <w:rPr>
+        <w:rFonts w:ascii="Wingdings" w:hAnsi="Wingdings" w:hint="default"/>
+      </w:rPr>
+    </w:lvl>
+    <w:lvl w:ilvl="5" w:tplc="04090005" w:tentative="1">
+      <w:start w:val="1"/>
+      <w:numFmt w:val="bullet"/>
+      <w:lvlText w:val=""/>
+      <w:lvlJc w:val="left"/>
+      <w:pPr>
+        <w:ind w:left="3360" w:hanging="480"/>
+      </w:pPr>
+      <w:rPr>
+        <w:rFonts w:ascii="Wingdings" w:hAnsi="Wingdings" w:hint="default"/>
+      </w:rPr>
+    </w:lvl>
+    <w:lvl w:ilvl="6" w:tplc="04090001" w:tentative="1">
+      <w:start w:val="1"/>
+      <w:numFmt w:val="bullet"/>
+      <w:lvlText w:val=""/>
+      <w:lvlJc w:val="left"/>
+      <w:pPr>
+        <w:ind w:left="3840" w:hanging="480"/>
+      </w:pPr>
+      <w:rPr>
+        <w:rFonts w:ascii="Wingdings" w:hAnsi="Wingdings" w:hint="default"/>
+      </w:rPr>
+    </w:lvl>
+    <w:lvl w:ilvl="7" w:tplc="04090003" w:tentative="1">
+      <w:start w:val="1"/>
+      <w:numFmt w:val="bullet"/>
+      <w:lvlText w:val=""/>
+      <w:lvlJc w:val="left"/>
+      <w:pPr>
+        <w:ind w:left="4320" w:hanging="480"/>
+      </w:pPr>
+      <w:rPr>
+        <w:rFonts w:ascii="Wingdings" w:hAnsi="Wingdings" w:hint="default"/>
+      </w:rPr>
+    </w:lvl>
+    <w:lvl w:ilvl="8" w:tplc="04090005" w:tentative="1">
+      <w:start w:val="1"/>
+      <w:numFmt w:val="bullet"/>
+      <w:lvlText w:val=""/>
+      <w:lvlJc w:val="left"/>
+      <w:pPr>
+        <w:ind w:left="4800" w:hanging="480"/>
+      </w:pPr>
+      <w:rPr>
+        <w:rFonts w:ascii="Wingdings" w:hAnsi="Wingdings" w:hint="default"/>
+      </w:rPr>
+    </w:lvl>
+  </w:abstractNum>
+  <w:abstractNum w:abstractNumId="15" w15:restartNumberingAfterBreak="0">
+    <w:nsid w:val="79A20583"/>
+    <w:multiLevelType w:val="hybridMultilevel"/>
+    <w:tmpl w:val="267242A0"/>
+    <w:lvl w:ilvl="0" w:tplc="04090001">
+      <w:start w:val="1"/>
+      <w:numFmt w:val="bullet"/>
+      <w:lvlText w:val=""/>
       <w:lvlJc w:val="left"/>
       <w:pPr>
         <w:ind w:left="960" w:hanging="480"/>
@@ -8445,43 +8770,49 @@
     <w:abstractNumId w:val="0"/>
   </w:num>
   <w:num w:numId="2" w16cid:durableId="1386563949">
-    <w:abstractNumId w:val="7"/>
+    <w:abstractNumId w:val="8"/>
   </w:num>
   <w:num w:numId="3" w16cid:durableId="1979606852">
-    <w:abstractNumId w:val="12"/>
+    <w:abstractNumId w:val="13"/>
   </w:num>
   <w:num w:numId="4" w16cid:durableId="401223144">
-    <w:abstractNumId w:val="9"/>
+    <w:abstractNumId w:val="10"/>
   </w:num>
   <w:num w:numId="5" w16cid:durableId="1191266182">
-    <w:abstractNumId w:val="13"/>
+    <w:abstractNumId w:val="14"/>
   </w:num>
   <w:num w:numId="6" w16cid:durableId="1085112110">
     <w:abstractNumId w:val="2"/>
   </w:num>
   <w:num w:numId="7" w16cid:durableId="388186633">
-    <w:abstractNumId w:val="10"/>
+    <w:abstractNumId w:val="11"/>
   </w:num>
   <w:num w:numId="8" w16cid:durableId="850799265">
     <w:abstractNumId w:val="1"/>
   </w:num>
   <w:num w:numId="9" w16cid:durableId="1815370726">
-    <w:abstractNumId w:val="6"/>
+    <w:abstractNumId w:val="7"/>
   </w:num>
   <w:num w:numId="10" w16cid:durableId="1773430557">
-    <w:abstractNumId w:val="11"/>
+    <w:abstractNumId w:val="12"/>
   </w:num>
   <w:num w:numId="11" w16cid:durableId="1995986303">
     <w:abstractNumId w:val="3"/>
   </w:num>
   <w:num w:numId="12" w16cid:durableId="1444229074">
-    <w:abstractNumId w:val="5"/>
+    <w:abstractNumId w:val="6"/>
   </w:num>
   <w:num w:numId="13" w16cid:durableId="944651492">
     <w:abstractNumId w:val="4"/>
   </w:num>
   <w:num w:numId="14" w16cid:durableId="718628711">
-    <w:abstractNumId w:val="8"/>
+    <w:abstractNumId w:val="9"/>
+  </w:num>
+  <w:num w:numId="15" w16cid:durableId="521746131">
+    <w:abstractNumId w:val="15"/>
+  </w:num>
+  <w:num w:numId="16" w16cid:durableId="1668751949">
+    <w:abstractNumId w:val="5"/>
   </w:num>
 </w:numbering>
 </file>

</xml_diff>